<commit_message>
chore(entrega): el paquete lleva los .html de campo del primer nivel; Word regenerados desde sus .md
Co-Authored-By: Claude Opus 5.5 (1M context) <noreply@anthropic.com>
</commit_message>
<xml_diff>
--- a/05_Funcional/10_Manual_Modulo_Bluetooth_Telemetria.docx
+++ b/05_Funcional/10_Manual_Modulo_Bluetooth_Telemetria.docx
@@ -786,7 +786,7 @@
           <w:color w:val="960000"/>
           <w:sz w:val="20"/>
         </w:rPr>
-        <w:t>05_Funcional/15_Lista_de_Compras_Hardware.md</w:t>
+        <w:t>05_Funcional/historico/15_Lista_de_Compras_Hardware.md</w:t>
       </w:r>
       <w:r>
         <w:rPr>
@@ -8016,7 +8016,87 @@
           <w:color w:val="960000"/>
           <w:sz w:val="20"/>
         </w:rPr>
-        <w:t xml:space="preserve">🛑 </w:t>
+        <w:t xml:space="preserve">🔵 </w:t>
+      </w:r>
+      <w:r>
+        <w:rPr>
+          <w:b/>
+          <w:color w:val="960000"/>
+          <w:sz w:val="20"/>
+        </w:rPr>
+        <w:t>11/09 (`D-26`, construida en `68dd2c5`, sin banco) — ESTA CAJA ESTÁ CADUCADA EN SU NÚCLEO, Y SE CORRIGE HACIA LA DECISIÓN:</w:t>
+      </w:r>
+      <w:r>
+        <w:rPr>
+          <w:b w:val="0"/>
+          <w:color w:val="960000"/>
+          <w:sz w:val="20"/>
+        </w:rPr>
+        <w:t xml:space="preserve"> «ajustar el reloj» </w:t>
+      </w:r>
+      <w:r>
+        <w:rPr>
+          <w:b/>
+          <w:color w:val="960000"/>
+          <w:sz w:val="20"/>
+        </w:rPr>
+        <w:t>vuelve</w:t>
+      </w:r>
+      <w:r>
+        <w:rPr>
+          <w:b w:val="0"/>
+          <w:color w:val="960000"/>
+          <w:sz w:val="20"/>
+        </w:rPr>
+        <w:t xml:space="preserve"> a la lista del poste 2. Con radio, su controladora hace caso a la hora del Maestro; </w:t>
+      </w:r>
+      <w:r>
+        <w:rPr>
+          <w:b/>
+          <w:color w:val="960000"/>
+          <w:sz w:val="20"/>
+        </w:rPr>
+        <w:t>sin radio, toma la de su propio ESP32, que el técnico le pone desde el teléfono en su gabinete</w:t>
+      </w:r>
+      <w:r>
+        <w:rPr>
+          <w:b w:val="0"/>
+          <w:color w:val="960000"/>
+          <w:sz w:val="20"/>
+        </w:rPr>
+        <w:t xml:space="preserve"> —es lo que se hace cuando salta la alarma de radio—. La prohibición de abajo ya estaba tachada en la propia fila </w:t>
+      </w:r>
+      <w:r>
+        <w:rPr>
+          <w:rFonts w:ascii="Consolas" w:hAnsi="Consolas"/>
+          <w:color w:val="960000"/>
+          <w:sz w:val="20"/>
+        </w:rPr>
+        <w:t>D-20</w:t>
+      </w:r>
+      <w:r>
+        <w:rPr>
+          <w:b w:val="0"/>
+          <w:color w:val="960000"/>
+          <w:sz w:val="20"/>
+        </w:rPr>
+        <w:t xml:space="preserve"> el 07/09 por la noche (*«la barrera es la SOBREESCRITURA»*). Qué ve y qué hace el técnico: </w:t>
+      </w:r>
+      <w:r>
+        <w:rPr>
+          <w:rFonts w:ascii="Consolas" w:hAnsi="Consolas"/>
+          <w:color w:val="960000"/>
+          <w:sz w:val="20"/>
+        </w:rPr>
+        <w:t>14_Manual_App_Movil_IOT_VIAL.md</w:t>
+      </w:r>
+      <w:r>
+        <w:rPr>
+          <w:b w:val="0"/>
+          <w:color w:val="960000"/>
+          <w:sz w:val="20"/>
+        </w:rPr>
+        <w:t xml:space="preserve"> §5.3.bis. ~~🛑 </w:t>
       </w:r>
       <w:r>
         <w:rPr>
@@ -8032,23 +8112,23 @@
           <w:color w:val="960000"/>
           <w:sz w:val="20"/>
         </w:rPr>
-        <w:t xml:space="preserve"> </w:t>
-      </w:r>
-      <w:r>
-        <w:rPr>
-          <w:b/>
-          <w:color w:val="960000"/>
-          <w:sz w:val="20"/>
-        </w:rPr>
-        <w:t>LA AUTORIDAD DE LA HORA ES EL ESP32, SIEMPRE Y PARA TODO.</w:t>
-      </w:r>
-      <w:r>
-        <w:rPr>
-          <w:b w:val="0"/>
-          <w:color w:val="960000"/>
-          <w:sz w:val="20"/>
-        </w:rPr>
-        <w:t xml:space="preserve"> La app le da la hora al </w:t>
+        <w:t xml:space="preserve">~~ </w:t>
+      </w:r>
+      <w:r>
+        <w:rPr>
+          <w:b/>
+          <w:color w:val="960000"/>
+          <w:sz w:val="20"/>
+        </w:rPr>
+        <w:t>LA AUTORIDAD DE LA HORA ES EL ESP32</w:t>
+      </w:r>
+      <w:r>
+        <w:rPr>
+          <w:b w:val="0"/>
+          <w:color w:val="960000"/>
+          <w:sz w:val="20"/>
+        </w:rPr>
+        <w:t xml:space="preserve">, ~~SIEMPRE Y PARA TODO. La app le da la hora al </w:t>
       </w:r>
       <w:r>
         <w:rPr>
@@ -8160,7 +8240,39 @@
           <w:color w:val="960000"/>
           <w:sz w:val="20"/>
         </w:rPr>
-        <w:t xml:space="preserve">. Fila </w:t>
+        <w:t xml:space="preserve">.~~ y el STM32 de cada punta la recibe </w:t>
+      </w:r>
+      <w:r>
+        <w:rPr>
+          <w:b/>
+          <w:color w:val="960000"/>
+          <w:sz w:val="20"/>
+        </w:rPr>
+        <w:t>de su propio ESP32</w:t>
+      </w:r>
+      <w:r>
+        <w:rPr>
+          <w:b w:val="0"/>
+          <w:color w:val="960000"/>
+          <w:sz w:val="20"/>
+        </w:rPr>
+        <w:t xml:space="preserve">; el del poste 2, </w:t>
+      </w:r>
+      <w:r>
+        <w:rPr>
+          <w:b/>
+          <w:color w:val="960000"/>
+          <w:sz w:val="20"/>
+        </w:rPr>
+        <w:t>con radio</w:t>
+      </w:r>
+      <w:r>
+        <w:rPr>
+          <w:b w:val="0"/>
+          <w:color w:val="960000"/>
+          <w:sz w:val="20"/>
+        </w:rPr>
+        <w:t xml:space="preserve">, hace caso a la del Maestro. Filas </w:t>
       </w:r>
       <w:r>
         <w:rPr>
@@ -8176,6 +8288,22 @@
           <w:color w:val="960000"/>
           <w:sz w:val="20"/>
         </w:rPr>
+        <w:t xml:space="preserve"> y </w:t>
+      </w:r>
+      <w:r>
+        <w:rPr>
+          <w:b/>
+          <w:color w:val="960000"/>
+          <w:sz w:val="20"/>
+        </w:rPr>
+        <w:t>`D-26`</w:t>
+      </w:r>
+      <w:r>
+        <w:rPr>
+          <w:b w:val="0"/>
+          <w:color w:val="960000"/>
+          <w:sz w:val="20"/>
+        </w:rPr>
         <w:t xml:space="preserve"> de </w:t>
       </w:r>
       <w:r>
@@ -8192,7 +8320,7 @@
           <w:color w:val="960000"/>
           <w:sz w:val="20"/>
         </w:rPr>
-        <w:t>, 07/09. ``</w:t>
+        <w:t>. ``</w:t>
       </w:r>
       <w:r>
         <w:rPr>
@@ -8231,7 +8359,7 @@
           <w:color w:val="960000"/>
           <w:sz w:val="20"/>
         </w:rPr>
-        <w:t xml:space="preserve"> se sigue mandando A LOS DOS POSTES.** </w:t>
+        <w:t xml:space="preserve"> se sigue mandando A LOS DOS POSTES.** ~~</w:t>
       </w:r>
       <w:r>
         <w:rPr>
@@ -8247,7 +8375,7 @@
           <w:color w:val="960000"/>
           <w:sz w:val="20"/>
         </w:rPr>
-        <w:t xml:space="preserve"> prohíbe **escribir** la hora en el poste 2; **leerla no escribe nada**, y con </w:t>
+        <w:t xml:space="preserve"> prohíbe **escribir** la hora en el poste 2;~~ **leerla no escribe nada** ~~, y con </w:t>
       </w:r>
       <w:r>
         <w:rPr>
@@ -8263,7 +8391,39 @@
           <w:color w:val="960000"/>
           <w:sz w:val="20"/>
         </w:rPr>
-        <w:t xml:space="preserve"> construida es la única forma de comprobar que la siembra del Maestro llegó de verdad. 🔴 **DECIDIDA Y SIN CONSTRUIR. Medido el 07/09, corrido antes de publicarlo:** </w:t>
+        <w:t xml:space="preserve"> construida es la única forma de comprobar que la siembra del Maestro llegó de verdad~~ *(11/09: la radio no escribe el </w:t>
+      </w:r>
+      <w:r>
+        <w:rPr>
+          <w:b w:val="0"/>
+          <w:color w:val="960000"/>
+          <w:sz w:val="20"/>
+        </w:rPr>
+        <w:t>DS3231</w:t>
+      </w:r>
+      <w:r>
+        <w:rPr>
+          <w:rFonts w:ascii="Consolas" w:hAnsi="Consolas"/>
+          <w:color w:val="960000"/>
+          <w:sz w:val="20"/>
+        </w:rPr>
+        <w:t xml:space="preserve"> del poste 2; lo que mide es el salto que dará el poste 2 al perder la radio)*. ~~🔴 **DECIDIDA Y SIN CONSTRUIR.**~~ *(construida el 11/09 en </w:t>
+      </w:r>
+      <w:r>
+        <w:rPr>
+          <w:b w:val="0"/>
+          <w:color w:val="960000"/>
+          <w:sz w:val="20"/>
+        </w:rPr>
+        <w:t>68dd2c5</w:t>
+      </w:r>
+      <w:r>
+        <w:rPr>
+          <w:rFonts w:ascii="Consolas" w:hAnsi="Consolas"/>
+          <w:color w:val="960000"/>
+          <w:sz w:val="20"/>
+        </w:rPr>
+        <w:t xml:space="preserve">)* **Medido el 07/09, corrido antes de publicarlo** *(crónica)*: </w:t>
       </w:r>
       <w:r>
         <w:rPr>
@@ -8309,7 +8469,23 @@
           <w:color w:val="960000"/>
           <w:sz w:val="20"/>
         </w:rPr>
-        <w:t xml:space="preserve"> **no nombra al Esclavo ni una vez**: hoy lo atiende venga por donde venga. Falta también el mando **ESP32 → STM32** que siembre la hora en la controladora (el camino físico existe, </w:t>
+        <w:t xml:space="preserve"> **no nombra al Esclavo ni una vez**: hoy lo atiende venga por donde venga *(11/09: y con </w:t>
+      </w:r>
+      <w:r>
+        <w:rPr>
+          <w:b w:val="0"/>
+          <w:color w:val="960000"/>
+          <w:sz w:val="20"/>
+        </w:rPr>
+        <w:t>D-26</w:t>
+      </w:r>
+      <w:r>
+        <w:rPr>
+          <w:rFonts w:ascii="Consolas" w:hAnsi="Consolas"/>
+          <w:color w:val="960000"/>
+          <w:sz w:val="20"/>
+        </w:rPr>
+        <w:t xml:space="preserve"> es lo correcto)*. ~~Falta también el mando **ESP32 → STM32** que siembre la hora en la controladora (el camino físico existe, </w:t>
       </w:r>
       <w:r>
         <w:rPr>
@@ -8325,7 +8501,55 @@
           <w:color w:val="960000"/>
           <w:sz w:val="20"/>
         </w:rPr>
-        <w:t xml:space="preserve">; el mando no). ⚠️ **Mientras tanto NO hay ninguna otra vía de poner en hora el poste 2, así que hoy se sigue visitando y sincronizando allí. Eso es un ESTADO DECLARADO, no la arquitectura**, y muere el día que </w:t>
+        <w:t xml:space="preserve">; el mando no).~~ *(existe desde </w:t>
+      </w:r>
+      <w:r>
+        <w:rPr>
+          <w:b w:val="0"/>
+          <w:color w:val="960000"/>
+          <w:sz w:val="20"/>
+        </w:rPr>
+        <w:t>68dd2c5</w:t>
+      </w:r>
+      <w:r>
+        <w:rPr>
+          <w:rFonts w:ascii="Consolas" w:hAnsi="Consolas"/>
+          <w:color w:val="960000"/>
+          <w:sz w:val="20"/>
+        </w:rPr>
+        <w:t xml:space="preserve">: </w:t>
+      </w:r>
+      <w:r>
+        <w:rPr>
+          <w:b w:val="0"/>
+          <w:color w:val="960000"/>
+          <w:sz w:val="20"/>
+        </w:rPr>
+        <w:t>CMD:HORA_ESP32</w:t>
+      </w:r>
+      <w:r>
+        <w:rPr>
+          <w:rFonts w:ascii="Consolas" w:hAnsi="Consolas"/>
+          <w:color w:val="960000"/>
+          <w:sz w:val="20"/>
+        </w:rPr>
+        <w:t xml:space="preserve">, </w:t>
+      </w:r>
+      <w:r>
+        <w:rPr>
+          <w:b w:val="0"/>
+          <w:color w:val="960000"/>
+          <w:sz w:val="20"/>
+        </w:rPr>
+        <w:t>siembra.cpp</w:t>
+      </w:r>
+      <w:r>
+        <w:rPr>
+          <w:rFonts w:ascii="Consolas" w:hAnsi="Consolas"/>
+          <w:color w:val="960000"/>
+          <w:sz w:val="20"/>
+        </w:rPr>
+        <w:t xml:space="preserve">)* ~~⚠️ **Mientras tanto NO hay ninguna otra vía de poner en hora el poste 2, así que hoy se sigue visitando y sincronizando allí. Eso es un ESTADO DECLARADO, no la arquitectura**, y muere el día que </w:t>
       </w:r>
       <w:r>
         <w:rPr>
@@ -8341,7 +8565,23 @@
           <w:color w:val="960000"/>
           <w:sz w:val="20"/>
         </w:rPr>
-        <w:t xml:space="preserve"> se construya. 🔵 **Y la regla de operación que sale de todo esto: EL POSTE 2 SE PONE EN HORA EN LA PUESTA EN MARCHA, NO DURANTE LA AVERÍA.** Con </w:t>
+        <w:t xml:space="preserve"> se construya.~~ *(No muere: es el procedimiento de </w:t>
+      </w:r>
+      <w:r>
+        <w:rPr>
+          <w:b w:val="0"/>
+          <w:color w:val="960000"/>
+          <w:sz w:val="20"/>
+        </w:rPr>
+        <w:t>D-26</w:t>
+      </w:r>
+      <w:r>
+        <w:rPr>
+          <w:rFonts w:ascii="Consolas" w:hAnsi="Consolas"/>
+          <w:color w:val="960000"/>
+          <w:sz w:val="20"/>
+        </w:rPr>
+        <w:t xml:space="preserve"> (5).)* 🔵 **Y la regla de operación que sale de todo esto: EL POSTE 2 SE PONE EN HORA EN LA PUESTA EN MARCHA** ~~**, NO DURANTE LA AVERÍA.** Con </w:t>
       </w:r>
       <w:r>
         <w:rPr>
@@ -8357,7 +8597,23 @@
           <w:color w:val="960000"/>
           <w:sz w:val="20"/>
         </w:rPr>
-        <w:t xml:space="preserve"> dentro, el único camino al reloj del poste 2 pasa por la **radio**, y la radio se cae justo cuando hace falta el Modo Degradado — que es el modo que **exige hora**. ✅ **No es un problema: su </w:t>
+        <w:t xml:space="preserve"> dentro, el único camino al reloj del poste 2 pasa por la **radio**, y la radio se cae justo cuando hace falta el Modo Degradado — que es el modo que **exige hora**.~~ **Y CON LA RADIO CAÍDA, ALLÍ MISMO** (</w:t>
+      </w:r>
+      <w:r>
+        <w:rPr>
+          <w:b w:val="0"/>
+          <w:color w:val="960000"/>
+          <w:sz w:val="20"/>
+        </w:rPr>
+        <w:t>D-26</w:t>
+      </w:r>
+      <w:r>
+        <w:rPr>
+          <w:rFonts w:ascii="Consolas" w:hAnsi="Consolas"/>
+          <w:color w:val="960000"/>
+          <w:sz w:val="20"/>
+        </w:rPr>
+        <w:t xml:space="preserve">). ✅ **Su </w:t>
       </w:r>
       <w:r>
         <w:rPr>
@@ -8373,7 +8629,7 @@
           <w:color w:val="960000"/>
           <w:sz w:val="20"/>
         </w:rPr>
-        <w:t xml:space="preserve"> tiene pila y conserva la hora que ya tenía. Perder la radio no es perder la hora.** Lo que obliga es a ponerla **antes**: en la puesta en marcha, al cambiar la pila de ese módulo, y tras cualquier </w:t>
+        <w:t xml:space="preserve"> tiene pila y conserva la hora que ya tenía. Perder la radio no es perder la hora.** Por eso se pone también **antes**: en la puesta en marcha, al cambiar la pila de ese módulo, y tras cualquier </w:t>
       </w:r>
       <w:r>
         <w:rPr>
@@ -9007,7 +9263,7 @@
                 <w:rFonts w:ascii="Consolas" w:hAnsi="Consolas"/>
                 <w:sz w:val="19"/>
               </w:rPr>
-              <w:t>03_Hardware_Tarjeta/MAPEO_TARJETA_KICAD.md</w:t>
+              <w:t>05_Funcional/historico/MAPEO_TARJETA_KICAD.md</w:t>
             </w:r>
             <w:r>
               <w:rPr>
@@ -11823,7 +12079,7 @@
           <w:color w:val="960000"/>
           <w:sz w:val="20"/>
         </w:rPr>
-        <w:t>05_Funcional/15_Lista_de_Compras_Hardware.md:90</w:t>
+        <w:t>05_Funcional/historico/15_Lista_de_Compras_Hardware.md:90</w:t>
       </w:r>
       <w:r>
         <w:rPr>
@@ -14877,7 +15133,7 @@
           <w:color w:val="960000"/>
           <w:sz w:val="20"/>
         </w:rPr>
-        <w:t>Es la misma lección que `01_Firmware/TROUBLESHOOTING.md` dejó escrita con el repetidor el 31/07/2026:</w:t>
+        <w:t>Es la misma lección que `05_Funcional/historico/TROUBLESHOOTING.md` dejó escrita con el repetidor el 31/07/2026:</w:t>
       </w:r>
       <w:r>
         <w:rPr>
@@ -16194,7 +16450,7 @@
           <w:color w:val="960000"/>
           <w:sz w:val="20"/>
         </w:rPr>
-        <w:t xml:space="preserve"> Ver la caja larga del </w:t>
+        <w:t xml:space="preserve"> ~~Ver la caja larga del </w:t>
       </w:r>
       <w:r>
         <w:rPr>
@@ -16258,7 +16514,39 @@
           <w:color w:val="960000"/>
           <w:sz w:val="20"/>
         </w:rPr>
-        <w:t xml:space="preserve"> — hoy el poste 2 se sigue poniendo en hora visitándolo, y eso es un estado declarado, no la arquitectura.</w:t>
+        <w:t xml:space="preserve"> — hoy el poste 2 se sigue poniendo en hora visitándolo, y eso es un estado declarado, no la arquitectura.~~ 🔵 </w:t>
+      </w:r>
+      <w:r>
+        <w:rPr>
+          <w:b/>
+          <w:color w:val="960000"/>
+          <w:sz w:val="20"/>
+        </w:rPr>
+        <w:t>11/09 (`D-26`, `68dd2c5`, sin banco): la hora se pone en LOS DOS postes</w:t>
+      </w:r>
+      <w:r>
+        <w:rPr>
+          <w:b w:val="0"/>
+          <w:color w:val="960000"/>
+          <w:sz w:val="20"/>
+        </w:rPr>
+        <w:t xml:space="preserve">; el poste 2 hace caso a la del Maestro con radio y a la de su ESP32 sin ella. El Courier sigue derogado. </w:t>
+      </w:r>
+      <w:r>
+        <w:rPr>
+          <w:rFonts w:ascii="Consolas" w:hAnsi="Consolas"/>
+          <w:color w:val="960000"/>
+          <w:sz w:val="20"/>
+        </w:rPr>
+        <w:t>14_Manual_App_Movil_IOT_VIAL.md</w:t>
+      </w:r>
+      <w:r>
+        <w:rPr>
+          <w:b w:val="0"/>
+          <w:color w:val="960000"/>
+          <w:sz w:val="20"/>
+        </w:rPr>
+        <w:t xml:space="preserve"> §5.3.bis.</w:t>
       </w:r>
     </w:p>
     <w:p>
@@ -16335,7 +16623,7 @@
           <w:b w:val="0"/>
           <w:sz w:val="21"/>
         </w:rPr>
-        <w:t xml:space="preserve">). 🛑 </w:t>
+        <w:t xml:space="preserve">). ~~🛑 </w:t>
       </w:r>
       <w:r>
         <w:rPr>
@@ -16363,7 +16651,35 @@
           <w:b w:val="0"/>
           <w:sz w:val="21"/>
         </w:rPr>
-        <w:t xml:space="preserve"> — sería una segunda fuente de hora.</w:t>
+        <w:t xml:space="preserve"> — sería una segunda fuente de hora.~~ 🔵 </w:t>
+      </w:r>
+      <w:r>
+        <w:rPr>
+          <w:b/>
+          <w:sz w:val="21"/>
+        </w:rPr>
+        <w:t>11/09 (`D-26`): de los dos postes.</w:t>
+      </w:r>
+      <w:r>
+        <w:rPr>
+          <w:b w:val="0"/>
+          <w:sz w:val="21"/>
+        </w:rPr>
+        <w:t xml:space="preserve"> La atiende el puente, que la pasa a su controladora (</w:t>
+      </w:r>
+      <w:r>
+        <w:rPr>
+          <w:rFonts w:ascii="Consolas" w:hAnsi="Consolas"/>
+          <w:sz w:val="21"/>
+        </w:rPr>
+        <w:t>CMD:HORA_ESP32</w:t>
+      </w:r>
+      <w:r>
+        <w:rPr>
+          <w:b w:val="0"/>
+          <w:sz w:val="21"/>
+        </w:rPr>
+        <w:t>); ya no cruza al STM32.</w:t>
       </w:r>
     </w:p>
     <w:p>
@@ -16405,7 +16721,7 @@
           <w:b w:val="0"/>
           <w:sz w:val="21"/>
         </w:rPr>
-        <w:t xml:space="preserve"> Lee sin escribir, así que </w:t>
+        <w:t xml:space="preserve"> Lee sin escribir ~~, así que </w:t>
       </w:r>
       <w:r>
         <w:rPr>
@@ -16447,7 +16763,21 @@
           <w:b w:val="0"/>
           <w:sz w:val="21"/>
         </w:rPr>
-        <w:t xml:space="preserve">. Ver </w:t>
+        <w:t xml:space="preserve">~~ *(11/09: mide el salto que dará el poste 2 al perder la radio — la radio no escribe su </w:t>
+      </w:r>
+      <w:r>
+        <w:rPr>
+          <w:rFonts w:ascii="Consolas" w:hAnsi="Consolas"/>
+          <w:sz w:val="21"/>
+        </w:rPr>
+        <w:t>DS3231</w:t>
+      </w:r>
+      <w:r>
+        <w:rPr>
+          <w:b w:val="0"/>
+          <w:sz w:val="21"/>
+        </w:rPr>
+        <w:t xml:space="preserve">)*. Ver </w:t>
       </w:r>
       <w:r>
         <w:rPr>
@@ -16888,7 +17218,7 @@
           <w:color w:val="960000"/>
           <w:sz w:val="20"/>
         </w:rPr>
-        <w:t xml:space="preserve">. Las dos puntas del STM32 </w:t>
+        <w:t xml:space="preserve">. ~~Las dos puntas del STM32 </w:t>
       </w:r>
       <w:r>
         <w:rPr>
@@ -16984,7 +17314,119 @@
           <w:color w:val="960000"/>
           <w:sz w:val="20"/>
         </w:rPr>
-        <w:t xml:space="preserve">. 🛑 </w:t>
+        <w:t xml:space="preserve">.~~ 🔵 </w:t>
+      </w:r>
+      <w:r>
+        <w:rPr>
+          <w:b/>
+          <w:color w:val="960000"/>
+          <w:sz w:val="20"/>
+        </w:rPr>
+        <w:t>11/09 (`D-26`, `68dd2c5`): la orden ya NO LLEGA al STM32</w:t>
+      </w:r>
+      <w:r>
+        <w:rPr>
+          <w:b w:val="0"/>
+          <w:color w:val="960000"/>
+          <w:sz w:val="20"/>
+        </w:rPr>
+        <w:t xml:space="preserve"> —el puente se la queda— y ese </w:t>
+      </w:r>
+      <w:r>
+        <w:rPr>
+          <w:rFonts w:ascii="Consolas" w:hAnsi="Consolas"/>
+          <w:color w:val="960000"/>
+          <w:sz w:val="20"/>
+        </w:rPr>
+        <w:t>EVENT</w:t>
+      </w:r>
+      <w:r>
+        <w:rPr>
+          <w:b w:val="0"/>
+          <w:color w:val="960000"/>
+          <w:sz w:val="20"/>
+        </w:rPr>
+        <w:t xml:space="preserve"> ya no existe. Lo que la controladora recibe es </w:t>
+      </w:r>
+      <w:r>
+        <w:rPr>
+          <w:rFonts w:ascii="Consolas" w:hAnsi="Consolas"/>
+          <w:color w:val="960000"/>
+          <w:sz w:val="20"/>
+        </w:rPr>
+        <w:t>CMD:HORA_ESP32:…</w:t>
+      </w:r>
+      <w:r>
+        <w:rPr>
+          <w:b w:val="0"/>
+          <w:color w:val="960000"/>
+          <w:sz w:val="20"/>
+        </w:rPr>
+        <w:t xml:space="preserve"> con la hora releída del </w:t>
+      </w:r>
+      <w:r>
+        <w:rPr>
+          <w:rFonts w:ascii="Consolas" w:hAnsi="Consolas"/>
+          <w:color w:val="960000"/>
+          <w:sz w:val="20"/>
+        </w:rPr>
+        <w:t>DS3231</w:t>
+      </w:r>
+      <w:r>
+        <w:rPr>
+          <w:b w:val="0"/>
+          <w:color w:val="960000"/>
+          <w:sz w:val="20"/>
+        </w:rPr>
+        <w:t xml:space="preserve">, sin PIN y sin respuesta; en el diario queda </w:t>
+      </w:r>
+      <w:r>
+        <w:rPr>
+          <w:rFonts w:ascii="Consolas" w:hAnsi="Consolas"/>
+          <w:color w:val="960000"/>
+          <w:sz w:val="20"/>
+        </w:rPr>
+        <w:t>HORA_ESP32_SEMBRADA</w:t>
+      </w:r>
+      <w:r>
+        <w:rPr>
+          <w:b w:val="0"/>
+          <w:color w:val="960000"/>
+          <w:sz w:val="20"/>
+        </w:rPr>
+        <w:t xml:space="preserve"> (o, en el poste 2 con radio, </w:t>
+      </w:r>
+      <w:r>
+        <w:rPr>
+          <w:rFonts w:ascii="Consolas" w:hAnsi="Consolas"/>
+          <w:color w:val="960000"/>
+          <w:sz w:val="20"/>
+        </w:rPr>
+        <w:t>HORA_ESP32_IGNORADA_MANDA_RADIO</w:t>
+      </w:r>
+      <w:r>
+        <w:rPr>
+          <w:b w:val="0"/>
+          <w:color w:val="960000"/>
+          <w:sz w:val="20"/>
+        </w:rPr>
+        <w:t xml:space="preserve">) sólo en el cambio. </w:t>
+      </w:r>
+      <w:r>
+        <w:rPr>
+          <w:rFonts w:ascii="Consolas" w:hAnsi="Consolas"/>
+          <w:color w:val="960000"/>
+          <w:sz w:val="20"/>
+        </w:rPr>
+        <w:t>14_Manual_App_Movil_IOT_VIAL.md</w:t>
+      </w:r>
+      <w:r>
+        <w:rPr>
+          <w:b w:val="0"/>
+          <w:color w:val="960000"/>
+          <w:sz w:val="20"/>
+        </w:rPr>
+        <w:t xml:space="preserve"> §5.3.bis. ~~🛑 </w:t>
       </w:r>
       <w:r>
         <w:rPr>
@@ -17096,7 +17538,39 @@
           <w:color w:val="960000"/>
           <w:sz w:val="20"/>
         </w:rPr>
-        <w:t xml:space="preserve"> 🔴 </w:t>
+        <w:t xml:space="preserve">~~ *(Derogado: ya tachado en la propia fila </w:t>
+      </w:r>
+      <w:r>
+        <w:rPr>
+          <w:rFonts w:ascii="Consolas" w:hAnsi="Consolas"/>
+          <w:color w:val="960000"/>
+          <w:sz w:val="20"/>
+        </w:rPr>
+        <w:t>D-20</w:t>
+      </w:r>
+      <w:r>
+        <w:rPr>
+          <w:b w:val="0"/>
+          <w:color w:val="960000"/>
+          <w:sz w:val="20"/>
+        </w:rPr>
+        <w:t xml:space="preserve"> el 07/09 por la noche, y </w:t>
+      </w:r>
+      <w:r>
+        <w:rPr>
+          <w:rFonts w:ascii="Consolas" w:hAnsi="Consolas"/>
+          <w:color w:val="960000"/>
+          <w:sz w:val="20"/>
+        </w:rPr>
+        <w:t>D-26</w:t>
+      </w:r>
+      <w:r>
+        <w:rPr>
+          <w:b w:val="0"/>
+          <w:color w:val="960000"/>
+          <w:sz w:val="20"/>
+        </w:rPr>
+        <w:t xml:space="preserve"> manda ponerle la hora al poste 2 cuando cae la radio. El puente no rechaza nada: decide la controladora.)* 🔴 </w:t>
       </w:r>
       <w:r>
         <w:rPr>
@@ -17120,7 +17594,7 @@
           <w:color w:val="960000"/>
           <w:sz w:val="20"/>
         </w:rPr>
-        <w:t xml:space="preserve">bash $ grep -c "ESCLAVO\|Esclavo\|esclavo" 01_Firmware/ESP32_Expansion/src/despachador.cpp 0 </w:t>
+        <w:t xml:space="preserve">bash  grep -c "ESCLAVO\|Esclavo\|esclavo" 01_Firmware/ESP32_Expansion/src/despachador.cpp 0 </w:t>
       </w:r>
       <w:r>
         <w:rPr>
@@ -17942,7 +18416,7 @@
           <w:color w:val="960000"/>
           <w:sz w:val="20"/>
         </w:rPr>
-        <w:t xml:space="preserve"> 🛑 </w:t>
+        <w:t xml:space="preserve"> ~~🛑 </w:t>
       </w:r>
       <w:r>
         <w:rPr>
@@ -18054,7 +18528,55 @@
           <w:color w:val="960000"/>
           <w:sz w:val="20"/>
         </w:rPr>
-        <w:t xml:space="preserve"> hoy se sigue sincronizando allí, visitándolo. * 🔧 </w:t>
+        <w:t xml:space="preserve"> hoy se sigue sincronizando allí, visitándolo.~~ 🔵 </w:t>
+      </w:r>
+      <w:r>
+        <w:rPr>
+          <w:b/>
+          <w:color w:val="960000"/>
+          <w:sz w:val="20"/>
+        </w:rPr>
+        <w:t>11/09 (`D-26`): también ahí mismo.</w:t>
+      </w:r>
+      <w:r>
+        <w:rPr>
+          <w:b w:val="0"/>
+          <w:color w:val="960000"/>
+          <w:sz w:val="20"/>
+        </w:rPr>
+        <w:t xml:space="preserve"> Estos motivos son de </w:t>
+      </w:r>
+      <w:r>
+        <w:rPr>
+          <w:b/>
+          <w:color w:val="960000"/>
+          <w:sz w:val="20"/>
+        </w:rPr>
+        <w:t>su</w:t>
+      </w:r>
+      <w:r>
+        <w:rPr>
+          <w:b w:val="0"/>
+          <w:color w:val="960000"/>
+          <w:sz w:val="20"/>
+        </w:rPr>
+        <w:t xml:space="preserve"> </w:t>
+      </w:r>
+      <w:r>
+        <w:rPr>
+          <w:rFonts w:ascii="Consolas" w:hAnsi="Consolas"/>
+          <w:color w:val="960000"/>
+          <w:sz w:val="20"/>
+        </w:rPr>
+        <w:t>DS3231</w:t>
+      </w:r>
+      <w:r>
+        <w:rPr>
+          <w:b w:val="0"/>
+          <w:color w:val="960000"/>
+          <w:sz w:val="20"/>
+        </w:rPr>
+        <w:t xml:space="preserve">, y la radio no lo escribe: sólo se arreglan sincronizando en ese poste. * 🔧 </w:t>
       </w:r>
       <w:r>
         <w:rPr>
@@ -22927,6 +23449,27 @@
               </w:rPr>
               <w:t>con PIN</w:t>
             </w:r>
+            <w:r>
+              <w:rPr>
+                <w:b w:val="0"/>
+                <w:sz w:val="19"/>
+              </w:rPr>
+              <w:t xml:space="preserve"> *(11/09: el PIN ya no lo comprueba nadie, </w:t>
+            </w:r>
+            <w:r>
+              <w:rPr>
+                <w:rFonts w:ascii="Consolas" w:hAnsi="Consolas"/>
+                <w:sz w:val="19"/>
+              </w:rPr>
+              <w:t>D-26</w:t>
+            </w:r>
+            <w:r>
+              <w:rPr>
+                <w:b w:val="0"/>
+                <w:sz w:val="19"/>
+              </w:rPr>
+              <w:t xml:space="preserve"> (1))*</w:t>
+            </w:r>
           </w:p>
         </w:tc>
         <w:tc>
@@ -22940,7 +23483,7 @@
                 <w:b w:val="0"/>
                 <w:sz w:val="19"/>
               </w:rPr>
-              <w:t xml:space="preserve">🛑 </w:t>
+              <w:t xml:space="preserve">~~🛑 </w:t>
             </w:r>
             <w:r>
               <w:rPr>
@@ -22968,7 +23511,35 @@
                 <w:b w:val="0"/>
                 <w:sz w:val="19"/>
               </w:rPr>
-              <w:t>, 07/09)</w:t>
+              <w:t xml:space="preserve">, 07/09)~~ ✅ </w:t>
+            </w:r>
+            <w:r>
+              <w:rPr>
+                <w:b/>
+                <w:sz w:val="19"/>
+              </w:rPr>
+              <w:t>igual que en el Maestro</w:t>
+            </w:r>
+            <w:r>
+              <w:rPr>
+                <w:b w:val="0"/>
+                <w:sz w:val="19"/>
+              </w:rPr>
+              <w:t xml:space="preserve"> (</w:t>
+            </w:r>
+            <w:r>
+              <w:rPr>
+                <w:rFonts w:ascii="Consolas" w:hAnsi="Consolas"/>
+                <w:sz w:val="19"/>
+              </w:rPr>
+              <w:t>D-26</w:t>
+            </w:r>
+            <w:r>
+              <w:rPr>
+                <w:b w:val="0"/>
+                <w:sz w:val="19"/>
+              </w:rPr>
+              <w:t>, 11/09)</w:t>
             </w:r>
           </w:p>
         </w:tc>
@@ -22983,7 +23554,7 @@
                 <w:b w:val="0"/>
                 <w:sz w:val="19"/>
               </w:rPr>
-              <w:t xml:space="preserve">🔴 </w:t>
+              <w:t xml:space="preserve">~~🔴 </w:t>
             </w:r>
             <w:r>
               <w:rPr>
@@ -23053,91 +23624,105 @@
                 <w:b w:val="0"/>
                 <w:sz w:val="19"/>
               </w:rPr>
-              <w:t xml:space="preserve">. ⚠️ </w:t>
+              <w:t xml:space="preserve">. ⚠️ … </w:t>
             </w:r>
             <w:r>
               <w:rPr>
                 <w:b/>
                 <w:sz w:val="19"/>
               </w:rPr>
-              <w:t>Y ojo con lo que acusa qué:</w:t>
+              <w:t>el que tiene que rechazarla es el PUENTE del poste 2</w:t>
             </w:r>
             <w:r>
               <w:rPr>
                 <w:b w:val="0"/>
                 <w:sz w:val="19"/>
               </w:rPr>
-              <w:t xml:space="preserve"> el </w:t>
+              <w:t xml:space="preserve"> — y eso </w:t>
             </w:r>
             <w:r>
               <w:rPr>
                 <w:b/>
                 <w:sz w:val="19"/>
               </w:rPr>
-              <w:t>STM32</w:t>
+              <w:t>está SIN CONSTRUIR</w:t>
             </w:r>
             <w:r>
               <w:rPr>
                 <w:b w:val="0"/>
                 <w:sz w:val="19"/>
               </w:rPr>
-              <w:t xml:space="preserve"> de las dos puntas consume la orden en silencio desde </w:t>
+              <w:t xml:space="preserve">~~ 🔵 </w:t>
+            </w:r>
+            <w:r>
+              <w:rPr>
+                <w:b/>
+                <w:sz w:val="19"/>
+              </w:rPr>
+              <w:t>11/09 (`D-26`, `68dd2c5`): la fila vieja volvía a tener razón.</w:t>
+            </w:r>
+            <w:r>
+              <w:rPr>
+                <w:b w:val="0"/>
+                <w:sz w:val="19"/>
+              </w:rPr>
+              <w:t xml:space="preserve"> La atiende el puente de cada poste y </w:t>
+            </w:r>
+            <w:r>
+              <w:rPr>
+                <w:b/>
+                <w:sz w:val="19"/>
+              </w:rPr>
+              <w:t>no cruza</w:t>
+            </w:r>
+            <w:r>
+              <w:rPr>
+                <w:b w:val="0"/>
+                <w:sz w:val="19"/>
+              </w:rPr>
+              <w:t xml:space="preserve"> al STM32. Lo asimétrico es qué hace cada controladora con la hora que su ESP32 le pasa: el Maestro la toma siempre; </w:t>
+            </w:r>
+            <w:r>
+              <w:rPr>
+                <w:b/>
+                <w:sz w:val="19"/>
+              </w:rPr>
+              <w:t>el Esclavo, sólo sin radio</w:t>
+            </w:r>
+            <w:r>
+              <w:rPr>
+                <w:b w:val="0"/>
+                <w:sz w:val="19"/>
+              </w:rPr>
+              <w:t xml:space="preserve"> (</w:t>
             </w:r>
             <w:r>
               <w:rPr>
                 <w:rFonts w:ascii="Consolas" w:hAnsi="Consolas"/>
                 <w:sz w:val="19"/>
               </w:rPr>
-              <w:t>D-15</w:t>
+              <w:t>§1</w:t>
             </w:r>
             <w:r>
               <w:rPr>
                 <w:b w:val="0"/>
                 <w:sz w:val="19"/>
               </w:rPr>
-              <w:t xml:space="preserve">; </w:t>
-            </w:r>
-            <w:r>
-              <w:rPr>
-                <w:b/>
-                <w:sz w:val="19"/>
-              </w:rPr>
-              <w:t>el que tiene que rechazarla es el PUENTE del poste 2</w:t>
+              <w:t xml:space="preserve">, </w:t>
+            </w:r>
+            <w:r>
+              <w:rPr>
+                <w:rFonts w:ascii="Consolas" w:hAnsi="Consolas"/>
+                <w:sz w:val="19"/>
+              </w:rPr>
+              <w:t>14_…</w:t>
             </w:r>
             <w:r>
               <w:rPr>
                 <w:b w:val="0"/>
                 <w:sz w:val="19"/>
               </w:rPr>
-              <w:t xml:space="preserve"> — y eso </w:t>
-            </w:r>
-            <w:r>
-              <w:rPr>
-                <w:b/>
-                <w:sz w:val="19"/>
-              </w:rPr>
-              <w:t>está SIN CONSTRUIR</w:t>
-            </w:r>
-            <w:r>
-              <w:rPr>
-                <w:b w:val="0"/>
-                <w:sz w:val="19"/>
-              </w:rPr>
-              <w:t xml:space="preserve"> (</w:t>
-            </w:r>
-            <w:r>
-              <w:rPr>
-                <w:rFonts w:ascii="Consolas" w:hAnsi="Consolas"/>
-                <w:sz w:val="19"/>
-              </w:rPr>
-              <w:t>§1</w:t>
-            </w:r>
-            <w:r>
-              <w:rPr>
-                <w:b w:val="0"/>
-                <w:sz w:val="19"/>
-              </w:rPr>
-              <w:t>, la medida)</w:t>
+              <w:t xml:space="preserve"> §5.3.bis)</w:t>
             </w:r>
           </w:p>
         </w:tc>
@@ -30990,15 +31575,79 @@
           <w:color w:val="960000"/>
           <w:sz w:val="20"/>
         </w:rPr>
-        <w:t>Lo vigente (`D-20`, `DECISIONES.md`, 07/09): LA AUTORIDAD DE LA HORA ES EL ESP32.</w:t>
-      </w:r>
-      <w:r>
-        <w:rPr>
-          <w:b w:val="0"/>
-          <w:color w:val="960000"/>
-          <w:sz w:val="20"/>
-        </w:rPr>
-        <w:t xml:space="preserve"> La app se la da al </w:t>
+        <w:t>Lo vigente: LA AUTORIDAD DE LA HORA ES EL ESP32</w:t>
+      </w:r>
+      <w:r>
+        <w:rPr>
+          <w:b w:val="0"/>
+          <w:color w:val="960000"/>
+          <w:sz w:val="20"/>
+        </w:rPr>
+        <w:t xml:space="preserve"> (</w:t>
+      </w:r>
+      <w:r>
+        <w:rPr>
+          <w:rFonts w:ascii="Consolas" w:hAnsi="Consolas"/>
+          <w:color w:val="960000"/>
+          <w:sz w:val="20"/>
+        </w:rPr>
+        <w:t>D-20</w:t>
+      </w:r>
+      <w:r>
+        <w:rPr>
+          <w:b w:val="0"/>
+          <w:color w:val="960000"/>
+          <w:sz w:val="20"/>
+        </w:rPr>
+        <w:t xml:space="preserve">) </w:t>
+      </w:r>
+      <w:r>
+        <w:rPr>
+          <w:b/>
+          <w:color w:val="960000"/>
+          <w:sz w:val="20"/>
+        </w:rPr>
+        <w:t>de cada poste</w:t>
+      </w:r>
+      <w:r>
+        <w:rPr>
+          <w:b w:val="0"/>
+          <w:color w:val="960000"/>
+          <w:sz w:val="20"/>
+        </w:rPr>
+        <w:t xml:space="preserve"> (</w:t>
+      </w:r>
+      <w:r>
+        <w:rPr>
+          <w:rFonts w:ascii="Consolas" w:hAnsi="Consolas"/>
+          <w:color w:val="960000"/>
+          <w:sz w:val="20"/>
+        </w:rPr>
+        <w:t>D-26</w:t>
+      </w:r>
+      <w:r>
+        <w:rPr>
+          <w:b w:val="0"/>
+          <w:color w:val="960000"/>
+          <w:sz w:val="20"/>
+        </w:rPr>
+        <w:t xml:space="preserve">, 11/09, construida en </w:t>
+      </w:r>
+      <w:r>
+        <w:rPr>
+          <w:rFonts w:ascii="Consolas" w:hAnsi="Consolas"/>
+          <w:color w:val="960000"/>
+          <w:sz w:val="20"/>
+        </w:rPr>
+        <w:t>68dd2c5</w:t>
+      </w:r>
+      <w:r>
+        <w:rPr>
+          <w:b w:val="0"/>
+          <w:color w:val="960000"/>
+          <w:sz w:val="20"/>
+        </w:rPr>
+        <w:t xml:space="preserve">, sin banco). ~~La app se la da al </w:t>
       </w:r>
       <w:r>
         <w:rPr>
@@ -31078,30 +31727,46 @@
           <w:color w:val="960000"/>
           <w:sz w:val="20"/>
         </w:rPr>
-        <w:t xml:space="preserve"> ``</w:t>
-      </w:r>
-      <w:r>
-        <w:rPr>
-          <w:rFonts w:ascii="Consolas" w:hAnsi="Consolas"/>
-          <w:color w:val="960000"/>
-          <w:sz w:val="20"/>
-        </w:rPr>
-        <w:t xml:space="preserve"> ESP32-M  -&gt;  STM32-M  -&gt;  radio  -&gt;  STM32-E  -&gt;  ESP32-E      (los STM32 son CARTEROS) </w:t>
-      </w:r>
-      <w:r>
-        <w:rPr>
-          <w:rFonts w:ascii="Consolas" w:hAnsi="Consolas"/>
-          <w:color w:val="960000"/>
-          <w:sz w:val="20"/>
-        </w:rPr>
-      </w:r>
-      <w:r>
-        <w:rPr>
-          <w:rFonts w:ascii="Consolas" w:hAnsi="Consolas"/>
-          <w:color w:val="960000"/>
-          <w:sz w:val="20"/>
-        </w:rPr>
-        <w:t xml:space="preserve"> 🔴 **DECIDIDA Y SIN CONSTRUIR** — la medida está en </w:t>
+        <w:t xml:space="preserve">~~ </w:t>
+      </w:r>
+      <w:r>
+        <w:rPr>
+          <w:b/>
+          <w:color w:val="960000"/>
+          <w:sz w:val="20"/>
+        </w:rPr>
+        <w:t>Con radio, el poste 2 hace caso a la del Maestro; sin radio, a la de su propio ESP32</w:t>
+      </w:r>
+      <w:r>
+        <w:rPr>
+          <w:b w:val="0"/>
+          <w:color w:val="960000"/>
+          <w:sz w:val="20"/>
+        </w:rPr>
+        <w:t>, que el técnico le pone desde el teléfono en su gabinete. ``</w:t>
+      </w:r>
+      <w:r>
+        <w:rPr>
+          <w:rFonts w:ascii="Consolas" w:hAnsi="Consolas"/>
+          <w:color w:val="960000"/>
+          <w:sz w:val="20"/>
+        </w:rPr>
+        <w:t xml:space="preserve"> ESP32-M  -&gt;  STM32-M  -&gt;  radio  -&gt;  STM32-E            (con radio; los STM32 son CARTEROS) ESP32-E  -&gt;  STM32-E           (SIN radio 25 s) </w:t>
+      </w:r>
+      <w:r>
+        <w:rPr>
+          <w:rFonts w:ascii="Consolas" w:hAnsi="Consolas"/>
+          <w:color w:val="960000"/>
+          <w:sz w:val="20"/>
+        </w:rPr>
+      </w:r>
+      <w:r>
+        <w:rPr>
+          <w:rFonts w:ascii="Consolas" w:hAnsi="Consolas"/>
+          <w:color w:val="960000"/>
+          <w:sz w:val="20"/>
+        </w:rPr>
+        <w:t xml:space="preserve"> ~~🔴 **DECIDIDA Y SIN CONSTRUIR** — la medida está en </w:t>
       </w:r>
       <w:r>
         <w:rPr>
@@ -31133,7 +31798,39 @@
           <w:color w:val="960000"/>
           <w:sz w:val="20"/>
         </w:rPr>
-        <w:t xml:space="preserve"> se construya. 🔵 **Y la regla que este apartado del corredor vial necesita: EL POSTE 2 SE PONE EN HORA EN LA PUESTA EN MARCHA, NO DURANTE LA AVERÍA.** El único camino al reloj del poste 2 pasará por la radio, y la radio se cae justo cuando hace falta el Modo Degradado — que es el modo que **exige hora**. ✅ **Su </w:t>
+        <w:t xml:space="preserve"> se construya.~~ *(11/09: visitar el poste 2 con «Sincronizar reloj» es el procedimiento de </w:t>
+      </w:r>
+      <w:r>
+        <w:rPr>
+          <w:b w:val="0"/>
+          <w:color w:val="960000"/>
+          <w:sz w:val="20"/>
+        </w:rPr>
+        <w:t>D-26</w:t>
+      </w:r>
+      <w:r>
+        <w:rPr>
+          <w:rFonts w:ascii="Consolas" w:hAnsi="Consolas"/>
+          <w:color w:val="960000"/>
+          <w:sz w:val="20"/>
+        </w:rPr>
+        <w:t>, no un estado temporal.)* 🔵 **Y la regla que este apartado del corredor vial necesita: EL POSTE 2 SE PONE EN HORA EN LA PUESTA EN MARCHA** ~~**, NO DURANTE LA AVERÍA.** El único camino al reloj del poste 2 pasará por la radio, y la radio se cae justo cuando hace falta el Modo Degradado — que es el modo que **exige hora**.~~ **Y CON LA RADIO CAÍDA, ALLÍ MISMO** (</w:t>
+      </w:r>
+      <w:r>
+        <w:rPr>
+          <w:b w:val="0"/>
+          <w:color w:val="960000"/>
+          <w:sz w:val="20"/>
+        </w:rPr>
+        <w:t>D-26</w:t>
+      </w:r>
+      <w:r>
+        <w:rPr>
+          <w:rFonts w:ascii="Consolas" w:hAnsi="Consolas"/>
+          <w:color w:val="960000"/>
+          <w:sz w:val="20"/>
+        </w:rPr>
+        <w:t xml:space="preserve"> (5)). ✅ **Su </w:t>
       </w:r>
       <w:r>
         <w:rPr>

</xml_diff>